<commit_message>
Add mobility structure section to AMC v3_3 template
</commit_message>
<xml_diff>
--- a/output/AMC_Report_Latest_v3_3.docx
+++ b/output/AMC_Report_Latest_v3_3.docx
@@ -138,87 +138,36 @@
     <w:p>
       <w:r>
         <w:rPr>
+          <w:b/>
+        </w:rPr>
+        <w:t>External Snapshot</w:t>
+      </w:r>
+    </w:p>
+    <w:p>
+      <w:r>
+        <w:t>External Snapshot Type: industry_transition</w:t>
+      </w:r>
+    </w:p>
+    <w:p>
+      <w:r>
+        <w:t>Hiring demand appears cyclical with moderate sensitivity to macro conditions.</w:t>
+        <w:br/>
+        <w:t>Signals indicate moderate competition with differentiation driven by domain expertise.</w:t>
+        <w:br/>
+        <w:t>Compensation bands remain relatively stable while upside dispersion increases at senior levels.</w:t>
+        <w:br/>
+        <w:t>Transition feasibility depends primarily on network access and role-specific signaling.</w:t>
+      </w:r>
+    </w:p>
+    <w:p>
+      <w:r>
+        <w:rPr>
           <w:rFonts w:ascii="Garamond" w:hAnsi="Garamond"/>
           <w:b/>
           <w:sz w:val="28"/>
         </w:rPr>
         <w:t>Five-Factor Structural Matrix</w:t>
       </w:r>
-    </w:p>
-    <w:p>
-      <w:r>
-        <w:rPr>
-          <w:sz w:val="20"/>
-        </w:rPr>
-        <w:t>Mobility and institutional friction appears moderate, with identifiable but manageable constraints.</w:t>
-      </w:r>
-    </w:p>
-    <w:p>
-      <w:r>
-        <w:rPr>
-          <w:sz w:val="20"/>
-        </w:rPr>
-        <w:t>Mobility &amp; Institutional</w:t>
-      </w:r>
-    </w:p>
-    <w:p>
-      <w:r>
-        <w:rPr>
-          <w:sz w:val="20"/>
-        </w:rPr>
-        <w:t>Signals indicate high gate dependency and concentrated selection pressure.</w:t>
-      </w:r>
-    </w:p>
-    <w:p>
-      <w:r>
-        <w:rPr>
-          <w:sz w:val="20"/>
-        </w:rPr>
-        <w:t>Credential &amp; Competition</w:t>
-      </w:r>
-    </w:p>
-    <w:p>
-      <w:r>
-        <w:rPr>
-          <w:sz w:val="20"/>
-        </w:rPr>
-        <w:t>Buffer resilience appears thin, and pressure remains concentrated in cash-flow stability.</w:t>
-      </w:r>
-    </w:p>
-    <w:p>
-      <w:r>
-        <w:rPr>
-          <w:sz w:val="20"/>
-        </w:rPr>
-        <w:t>Income / Buffer Pressure</w:t>
-      </w:r>
-    </w:p>
-    <w:p>
-      <w:r>
-        <w:rPr>
-          <w:sz w:val="20"/>
-        </w:rPr>
-        <w:t>Signals suggest a high-commit transition profile with constrained rollback options.</w:t>
-      </w:r>
-    </w:p>
-    <w:p>
-      <w:r>
-        <w:rPr>
-          <w:sz w:val="20"/>
-        </w:rPr>
-        <w:t>Transition Reality</w:t>
-      </w:r>
-    </w:p>
-    <w:p>
-      <w:r>
-        <w:rPr>
-          <w:sz w:val="20"/>
-        </w:rPr>
-        <w:t>External Snapshot</w:t>
-      </w:r>
-    </w:p>
-    <w:p>
-      <w:r/>
     </w:p>
     <w:tbl>
       <w:tblPr>
@@ -289,7 +238,7 @@
           </w:tcPr>
           <w:p>
             <w:r>
-              <w:t>▮▮▯▯▯</w:t>
+              <w:t>▮▯▯</w:t>
             </w:r>
           </w:p>
         </w:tc>
@@ -321,7 +270,7 @@
           </w:tcPr>
           <w:p>
             <w:r>
-              <w:t>▮▮▯▯▯</w:t>
+              <w:t>▮▯▯</w:t>
             </w:r>
           </w:p>
         </w:tc>
@@ -353,7 +302,7 @@
           </w:tcPr>
           <w:p>
             <w:r>
-              <w:t>▮▮▯▯▯</w:t>
+              <w:t>▮▯▯</w:t>
             </w:r>
           </w:p>
         </w:tc>
@@ -385,7 +334,7 @@
           </w:tcPr>
           <w:p>
             <w:r>
-              <w:t>▮▮▯▯▯</w:t>
+              <w:t>▮▯▯</w:t>
             </w:r>
           </w:p>
         </w:tc>
@@ -417,7 +366,7 @@
           </w:tcPr>
           <w:p>
             <w:r>
-              <w:t>▮▮▯▯▯</w:t>
+              <w:t>▮▯▯</w:t>
             </w:r>
           </w:p>
         </w:tc>
@@ -1216,6 +1165,44 @@
         <w:t>This report applies the AMC Strategic Career Decision Architecture to map structural risk and decision exposure.</w:t>
       </w:r>
     </w:p>
+    <w:p>
+      <w:r>
+        <w:rPr>
+          <w:b/>
+        </w:rPr>
+        <w:t>Career Mobility Structure</w:t>
+      </w:r>
+    </w:p>
+    <w:p>
+      <w:r>
+        <w:t>Mobility Type</w:t>
+      </w:r>
+    </w:p>
+    <w:p>
+      <w:r>
+        <w:t>Category Expansion</w:t>
+      </w:r>
+    </w:p>
+    <w:p>
+      <w:r>
+        <w:t>Mobility Reading</w:t>
+      </w:r>
+    </w:p>
+    <w:p>
+      <w:r>
+        <w:t>This decision suggests a structural expansion from the current path into an adjacent domain.</w:t>
+      </w:r>
+    </w:p>
+    <w:p>
+      <w:r>
+        <w:t>Mobility Implication</w:t>
+      </w:r>
+    </w:p>
+    <w:p>
+      <w:r>
+        <w:t>Skill transfer remains partially intact, though positioning must be re-established.</w:t>
+      </w:r>
+    </w:p>
     <w:sectPr>
       <w:pgSz w:w="12240" w:h="15840"/>
       <w:pgMar w:top="1440" w:right="1138" w:bottom="1440" w:left="1138" w:header="720" w:footer="720" w:gutter="0"/>

</xml_diff>

<commit_message>
Add internal structural snapshot to AMC v3_3 report
</commit_message>
<xml_diff>
--- a/output/AMC_Report_Latest_v3_3.docx
+++ b/output/AMC_Report_Latest_v3_3.docx
@@ -1203,6 +1203,19 @@
         <w:t>Skill transfer remains partially intact, though positioning must be re-established.</w:t>
       </w:r>
     </w:p>
+    <w:p>
+      <w:r>
+        <w:rPr>
+          <w:b w:val="0"/>
+        </w:rPr>
+        <w:t>Internal Structural Snapshot</w:t>
+      </w:r>
+    </w:p>
+    <w:p>
+      <w:r>
+        <w:t>Structural risk appears concentrated in downside pressure, transition irreversibility, and gate dependency.</w:t>
+      </w:r>
+    </w:p>
     <w:sectPr>
       <w:pgSz w:w="12240" w:h="15840"/>
       <w:pgMar w:top="1440" w:right="1138" w:bottom="1440" w:left="1138" w:header="720" w:footer="720" w:gutter="0"/>

</xml_diff>

<commit_message>
Add career value structure section to AMC v3_3 template
</commit_message>
<xml_diff>
--- a/output/AMC_Report_Latest_v3_3.docx
+++ b/output/AMC_Report_Latest_v3_3.docx
@@ -1216,6 +1216,54 @@
         <w:t>Structural risk appears concentrated in downside pressure, transition irreversibility, and gate dependency.</w:t>
       </w:r>
     </w:p>
+    <w:p>
+      <w:r>
+        <w:rPr>
+          <w:b/>
+        </w:rPr>
+        <w:t>Career Value Structure</w:t>
+      </w:r>
+    </w:p>
+    <w:p>
+      <w:r>
+        <w:t>Current Path</w:t>
+      </w:r>
+    </w:p>
+    <w:p>
+      <w:r>
+        <w:t>Established role continuity with preserved income structure.</w:t>
+      </w:r>
+    </w:p>
+    <w:p>
+      <w:r>
+        <w:t>Transition Path</w:t>
+      </w:r>
+    </w:p>
+    <w:p>
+      <w:r>
+        <w:t>Reduced immediate stability with greater structural re-positioning potential.</w:t>
+      </w:r>
+    </w:p>
+    <w:p>
+      <w:r>
+        <w:t>Value Reading</w:t>
+      </w:r>
+    </w:p>
+    <w:p>
+      <w:r>
+        <w:t>Current path protects near-term stability, while transition value remains conditional under tighter safety margins.</w:t>
+      </w:r>
+    </w:p>
+    <w:p>
+      <w:r>
+        <w:t>Value Implication</w:t>
+      </w:r>
+    </w:p>
+    <w:p>
+      <w:r>
+        <w:t>Primary tension is the balance between downside compression and future positioning optionality.</w:t>
+      </w:r>
+    </w:p>
     <w:sectPr>
       <w:pgSz w:w="12240" w:h="15840"/>
       <w:pgMar w:top="1440" w:right="1138" w:bottom="1440" w:left="1138" w:header="720" w:footer="720" w:gutter="0"/>

</xml_diff>

<commit_message>
Add strategic temperament section to AMC v3_3 report
</commit_message>
<xml_diff>
--- a/output/AMC_Report_Latest_v3_3.docx
+++ b/output/AMC_Report_Latest_v3_3.docx
@@ -1175,6 +1175,44 @@
     </w:p>
     <w:p>
       <w:r>
+        <w:rPr>
+          <w:b/>
+        </w:rPr>
+        <w:t>Strategic Temperament</w:t>
+      </w:r>
+    </w:p>
+    <w:p>
+      <w:r>
+        <w:t>Temperament Profile</w:t>
+      </w:r>
+    </w:p>
+    <w:p>
+      <w:r>
+        <w:t>Enterprising leaning</w:t>
+      </w:r>
+    </w:p>
+    <w:p>
+      <w:r>
+        <w:t>Temperament Reading</w:t>
+      </w:r>
+    </w:p>
+    <w:p>
+      <w:r>
+        <w:t>Behavioral profile suggests strong commitment once direction is chosen.</w:t>
+      </w:r>
+    </w:p>
+    <w:p>
+      <w:r>
+        <w:t>Temperament Implication</w:t>
+      </w:r>
+    </w:p>
+    <w:p>
+      <w:r>
+        <w:t>This increases tolerance for high-friction moves if structural upside remains credible.</w:t>
+      </w:r>
+    </w:p>
+    <w:p>
+      <w:r>
         <w:t>Mobility Type</w:t>
       </w:r>
     </w:p>

</xml_diff>

<commit_message>
Add executive dashboard section to AMC v3_3 template
</commit_message>
<xml_diff>
--- a/output/AMC_Report_Latest_v3_3.docx
+++ b/output/AMC_Report_Latest_v3_3.docx
@@ -2,6 +2,74 @@
 <file path=word/document.xml><?xml version="1.0" encoding="utf-8"?>
 <w:document xmlns:wpc="http://schemas.microsoft.com/office/word/2010/wordprocessingCanvas" xmlns:mo="http://schemas.microsoft.com/office/mac/office/2008/main" xmlns:mc="http://schemas.openxmlformats.org/markup-compatibility/2006" xmlns:mv="urn:schemas-microsoft-com:mac:vml" xmlns:o="urn:schemas-microsoft-com:office:office" xmlns:r="http://schemas.openxmlformats.org/officeDocument/2006/relationships" xmlns:m="http://schemas.openxmlformats.org/officeDocument/2006/math" xmlns:v="urn:schemas-microsoft-com:vml" xmlns:wp14="http://schemas.microsoft.com/office/word/2010/wordprocessingDrawing" xmlns:wp="http://schemas.openxmlformats.org/drawingml/2006/wordprocessingDrawing" xmlns:w10="urn:schemas-microsoft-com:office:word" xmlns:w="http://schemas.openxmlformats.org/wordprocessingml/2006/main" xmlns:w14="http://schemas.microsoft.com/office/word/2010/wordml" xmlns:wpg="http://schemas.microsoft.com/office/word/2010/wordprocessingGroup" xmlns:wpi="http://schemas.microsoft.com/office/word/2010/wordprocessingInk" xmlns:wne="http://schemas.microsoft.com/office/word/2006/wordml" xmlns:wps="http://schemas.microsoft.com/office/word/2010/wordprocessingShape" mc:Ignorable="w14 wp14">
   <w:body>
+    <w:p>
+      <w:r>
+        <w:t>Behavioral profile suggests strong commitment once direction is chosen.</w:t>
+      </w:r>
+    </w:p>
+    <w:p>
+      <w:r>
+        <w:t>Temperament Summary</w:t>
+      </w:r>
+    </w:p>
+    <w:p>
+      <w:r>
+        <w:t>This decision suggests a structural expansion from the current path into an adjacent domain.</w:t>
+      </w:r>
+    </w:p>
+    <w:p>
+      <w:r>
+        <w:t>Mobility Summary</w:t>
+      </w:r>
+    </w:p>
+    <w:p>
+      <w:r>
+        <w:t>Current path protects near-term stability, while transition value remains conditional under tighter safety margins.</w:t>
+      </w:r>
+    </w:p>
+    <w:p>
+      <w:r>
+        <w:t>Value Summary</w:t>
+      </w:r>
+    </w:p>
+    <w:p>
+      <w:r>
+        <w:t>Structural risk appears concentrated in downside pressure, transition irreversibility, and gate dependency.</w:t>
+      </w:r>
+    </w:p>
+    <w:p>
+      <w:r>
+        <w:t>Risk Summary</w:t>
+      </w:r>
+    </w:p>
+    <w:p>
+      <w:r>
+        <w:t>Structural upside remains conditional, with near-term pressure concentrated in key transition variables.</w:t>
+      </w:r>
+    </w:p>
+    <w:p>
+      <w:r>
+        <w:t>Core Structural Insight</w:t>
+      </w:r>
+    </w:p>
+    <w:p>
+      <w:r>
+        <w:t>Pivot – Hold</w:t>
+      </w:r>
+    </w:p>
+    <w:p>
+      <w:r>
+        <w:t>Decision Verdict</w:t>
+      </w:r>
+    </w:p>
+    <w:p>
+      <w:r>
+        <w:rPr>
+          <w:b/>
+        </w:rPr>
+        <w:t>Executive Dashboard</w:t>
+      </w:r>
+    </w:p>
     <w:p>
       <w:r>
         <w:rPr>
@@ -37,16 +105,6 @@
           <w:sz w:val="36"/>
         </w:rPr>
         <w:t>Executive Overview</w:t>
-      </w:r>
-    </w:p>
-    <w:p>
-      <w:r>
-        <w:rPr>
-          <w:rFonts w:ascii="Garamond" w:hAnsi="Garamond"/>
-          <w:b/>
-          <w:sz w:val="28"/>
-        </w:rPr>
-        <w:t>Decision Verdict</w:t>
       </w:r>
     </w:p>
     <w:p>

</xml_diff>

<commit_message>
Refine executive dashboard formatting in AMC v3_3 template
</commit_message>
<xml_diff>
--- a/output/AMC_Report_Latest_v3_3.docx
+++ b/output/AMC_Report_Latest_v3_3.docx
@@ -3,66 +3,146 @@
 <w:document xmlns:wpc="http://schemas.microsoft.com/office/word/2010/wordprocessingCanvas" xmlns:mo="http://schemas.microsoft.com/office/mac/office/2008/main" xmlns:mc="http://schemas.openxmlformats.org/markup-compatibility/2006" xmlns:mv="urn:schemas-microsoft-com:mac:vml" xmlns:o="urn:schemas-microsoft-com:office:office" xmlns:r="http://schemas.openxmlformats.org/officeDocument/2006/relationships" xmlns:m="http://schemas.openxmlformats.org/officeDocument/2006/math" xmlns:v="urn:schemas-microsoft-com:vml" xmlns:wp14="http://schemas.microsoft.com/office/word/2010/wordprocessingDrawing" xmlns:wp="http://schemas.openxmlformats.org/drawingml/2006/wordprocessingDrawing" xmlns:w10="urn:schemas-microsoft-com:office:word" xmlns:w="http://schemas.openxmlformats.org/wordprocessingml/2006/main" xmlns:w14="http://schemas.microsoft.com/office/word/2010/wordml" xmlns:wpg="http://schemas.microsoft.com/office/word/2010/wordprocessingGroup" xmlns:wpi="http://schemas.microsoft.com/office/word/2010/wordprocessingInk" xmlns:wne="http://schemas.microsoft.com/office/word/2006/wordml" xmlns:wps="http://schemas.microsoft.com/office/word/2010/wordprocessingShape" mc:Ignorable="w14 wp14">
   <w:body>
     <w:p>
+      <w:pPr>
+        <w:spacing w:after="280"/>
+      </w:pPr>
+    </w:p>
+    <w:p>
+      <w:pPr>
+        <w:spacing w:after="160"/>
+      </w:pPr>
       <w:r>
+        <w:rPr>
+          <w:b w:val="0"/>
+        </w:rPr>
         <w:t>Behavioral profile suggests strong commitment once direction is chosen.</w:t>
       </w:r>
     </w:p>
     <w:p>
+      <w:pPr>
+        <w:spacing w:after="0"/>
+      </w:pPr>
       <w:r>
+        <w:rPr>
+          <w:b w:val="0"/>
+        </w:rPr>
         <w:t>Temperament Summary</w:t>
       </w:r>
     </w:p>
     <w:p>
+      <w:pPr>
+        <w:spacing w:after="160"/>
+      </w:pPr>
       <w:r>
+        <w:rPr>
+          <w:b w:val="0"/>
+        </w:rPr>
         <w:t>This decision suggests a structural expansion from the current path into an adjacent domain.</w:t>
       </w:r>
     </w:p>
     <w:p>
+      <w:pPr>
+        <w:spacing w:after="0"/>
+      </w:pPr>
       <w:r>
+        <w:rPr>
+          <w:b w:val="0"/>
+        </w:rPr>
         <w:t>Mobility Summary</w:t>
       </w:r>
     </w:p>
     <w:p>
+      <w:pPr>
+        <w:spacing w:after="160"/>
+      </w:pPr>
       <w:r>
+        <w:rPr>
+          <w:b w:val="0"/>
+        </w:rPr>
         <w:t>Current path protects near-term stability, while transition value remains conditional under tighter safety margins.</w:t>
       </w:r>
     </w:p>
     <w:p>
+      <w:pPr>
+        <w:spacing w:after="0"/>
+      </w:pPr>
       <w:r>
+        <w:rPr>
+          <w:b w:val="0"/>
+        </w:rPr>
         <w:t>Value Summary</w:t>
       </w:r>
     </w:p>
     <w:p>
+      <w:pPr>
+        <w:spacing w:after="160"/>
+      </w:pPr>
       <w:r>
+        <w:rPr>
+          <w:b w:val="0"/>
+        </w:rPr>
         <w:t>Structural risk appears concentrated in downside pressure, transition irreversibility, and gate dependency.</w:t>
       </w:r>
     </w:p>
     <w:p>
+      <w:pPr>
+        <w:spacing w:after="0"/>
+      </w:pPr>
       <w:r>
+        <w:rPr>
+          <w:b w:val="0"/>
+        </w:rPr>
         <w:t>Risk Summary</w:t>
       </w:r>
     </w:p>
     <w:p>
+      <w:pPr>
+        <w:spacing w:after="160"/>
+      </w:pPr>
       <w:r>
+        <w:rPr>
+          <w:b w:val="0"/>
+        </w:rPr>
         <w:t>Structural upside remains conditional, with near-term pressure concentrated in key transition variables.</w:t>
       </w:r>
     </w:p>
     <w:p>
+      <w:pPr>
+        <w:spacing w:after="0"/>
+      </w:pPr>
       <w:r>
+        <w:rPr>
+          <w:b w:val="0"/>
+        </w:rPr>
         <w:t>Core Structural Insight</w:t>
       </w:r>
     </w:p>
     <w:p>
+      <w:pPr>
+        <w:spacing w:after="160"/>
+      </w:pPr>
       <w:r>
+        <w:rPr>
+          <w:b w:val="0"/>
+        </w:rPr>
         <w:t>Pivot – Hold</w:t>
       </w:r>
     </w:p>
     <w:p>
+      <w:pPr>
+        <w:spacing w:after="0"/>
+      </w:pPr>
       <w:r>
+        <w:rPr>
+          <w:b w:val="0"/>
+        </w:rPr>
         <w:t>Decision Verdict</w:t>
       </w:r>
     </w:p>
     <w:p>
+      <w:pPr>
+        <w:spacing w:after="200"/>
+      </w:pPr>
       <w:r>
         <w:rPr>
           <w:b/>

</xml_diff>

<commit_message>
Normalize external snapshot into four structured blocks
</commit_message>
<xml_diff>
--- a/output/AMC_Report_Latest_v3_3.docx
+++ b/output/AMC_Report_Latest_v3_3.docx
@@ -283,18 +283,74 @@
     </w:p>
     <w:p>
       <w:r>
-        <w:t>External Snapshot Type: industry_transition</w:t>
+        <w:rPr>
+          <w:b w:val="0"/>
+        </w:rPr>
+        <w:t>External Snapshot — Industry Transition</w:t>
       </w:r>
     </w:p>
     <w:p>
       <w:r>
-        <w:t>Hiring demand appears cyclical with moderate sensitivity to macro conditions.</w:t>
-        <w:br/>
-        <w:t>Signals indicate moderate competition with differentiation driven by domain expertise.</w:t>
-        <w:br/>
-        <w:t>Compensation bands remain relatively stable while upside dispersion increases at senior levels.</w:t>
-        <w:br/>
-        <w:t>Transition feasibility depends primarily on network access and role-specific signaling.</w:t>
+        <w:rPr>
+          <w:b w:val="0"/>
+        </w:rPr>
+        <w:t>Market Direction</w:t>
+      </w:r>
+    </w:p>
+    <w:p>
+      <w:r>
+        <w:rPr>
+          <w:b w:val="0"/>
+        </w:rPr>
+        <w:t>Market direction appears mixed, with directional visibility present but still moderated by external policy and cycle uncertainty.</w:t>
+      </w:r>
+    </w:p>
+    <w:p>
+      <w:r>
+        <w:rPr>
+          <w:b w:val="0"/>
+        </w:rPr>
+        <w:t>Competition Pressure</w:t>
+      </w:r>
+    </w:p>
+    <w:p>
+      <w:r>
+        <w:rPr>
+          <w:b w:val="0"/>
+        </w:rPr>
+        <w:t>Competition pressure appears high, with screening intensity concentrated in credential gates and differentiated positioning requirements.</w:t>
+      </w:r>
+    </w:p>
+    <w:p>
+      <w:r>
+        <w:rPr>
+          <w:b w:val="0"/>
+        </w:rPr>
+        <w:t>Economic Pressure</w:t>
+      </w:r>
+    </w:p>
+    <w:p>
+      <w:r>
+        <w:rPr>
+          <w:b w:val="0"/>
+        </w:rPr>
+        <w:t>Economic pressure appears elevated, as near-term income continuity and downside buffer resilience remain structurally constrained.</w:t>
+      </w:r>
+    </w:p>
+    <w:p>
+      <w:r>
+        <w:rPr>
+          <w:b w:val="0"/>
+        </w:rPr>
+        <w:t>Transition Friction</w:t>
+      </w:r>
+    </w:p>
+    <w:p>
+      <w:r>
+        <w:rPr>
+          <w:b w:val="0"/>
+        </w:rPr>
+        <w:t>Transition friction appears high, with path irreversibility and mobility constraints increasing execution drag across commitment stages.</w:t>
       </w:r>
     </w:p>
     <w:p>

</xml_diff>

<commit_message>
Add comparative external snapshot table to AMC v3_3 template
</commit_message>
<xml_diff>
--- a/output/AMC_Report_Latest_v3_3.docx
+++ b/output/AMC_Report_Latest_v3_3.docx
@@ -351,6 +351,205 @@
           <w:b w:val="0"/>
         </w:rPr>
         <w:t>Transition friction appears high, with path irreversibility and mobility constraints increasing execution drag across commitment stages.</w:t>
+      </w:r>
+    </w:p>
+    <w:p>
+      <w:r>
+        <w:rPr>
+          <w:b/>
+        </w:rPr>
+        <w:t>External Comparative Snapshot</w:t>
+      </w:r>
+    </w:p>
+    <w:tbl>
+      <w:tblPr>
+        <w:tblW w:type="auto" w:w="0"/>
+        <w:tblLook w:firstColumn="1" w:firstRow="1" w:lastColumn="0" w:lastRow="0" w:noHBand="0" w:noVBand="1" w:val="04A0"/>
+      </w:tblPr>
+      <w:tblGrid>
+        <w:gridCol w:w="3321"/>
+        <w:gridCol w:w="3321"/>
+        <w:gridCol w:w="3321"/>
+      </w:tblGrid>
+      <w:tr>
+        <w:tc>
+          <w:tcPr>
+            <w:tcW w:type="dxa" w:w="3321"/>
+          </w:tcPr>
+          <w:p>
+            <w:r>
+              <w:t>Dimension</w:t>
+            </w:r>
+          </w:p>
+        </w:tc>
+        <w:tc>
+          <w:tcPr>
+            <w:tcW w:type="dxa" w:w="3321"/>
+          </w:tcPr>
+          <w:p>
+            <w:r>
+              <w:t>Option A</w:t>
+            </w:r>
+          </w:p>
+        </w:tc>
+        <w:tc>
+          <w:tcPr>
+            <w:tcW w:type="dxa" w:w="3321"/>
+          </w:tcPr>
+          <w:p>
+            <w:r>
+              <w:t>Option B</w:t>
+            </w:r>
+          </w:p>
+        </w:tc>
+      </w:tr>
+      <w:tr>
+        <w:tc>
+          <w:tcPr>
+            <w:tcW w:type="dxa" w:w="3321"/>
+          </w:tcPr>
+          <w:p>
+            <w:r>
+              <w:t>Market Direction</w:t>
+            </w:r>
+          </w:p>
+        </w:tc>
+        <w:tc>
+          <w:tcPr>
+            <w:tcW w:type="dxa" w:w="3321"/>
+          </w:tcPr>
+          <w:p>
+            <w:r>
+              <w:t>Option A aligns with known market conditions, preserving directional visibility through lower external variance.</w:t>
+            </w:r>
+          </w:p>
+        </w:tc>
+        <w:tc>
+          <w:tcPr>
+            <w:tcW w:type="dxa" w:w="3321"/>
+          </w:tcPr>
+          <w:p>
+            <w:r>
+              <w:t>Option B offers broader repositioning exposure, though directional visibility remains more sensitive to cycle and policy variance.</w:t>
+            </w:r>
+          </w:p>
+        </w:tc>
+      </w:tr>
+      <w:tr>
+        <w:tc>
+          <w:tcPr>
+            <w:tcW w:type="dxa" w:w="3321"/>
+          </w:tcPr>
+          <w:p>
+            <w:r>
+              <w:t>Competition Pressure</w:t>
+            </w:r>
+          </w:p>
+        </w:tc>
+        <w:tc>
+          <w:tcPr>
+            <w:tcW w:type="dxa" w:w="3321"/>
+          </w:tcPr>
+          <w:p>
+            <w:r>
+              <w:t>Option A carries moderate competition pressure with transferable positioning from the current path architecture.</w:t>
+            </w:r>
+          </w:p>
+        </w:tc>
+        <w:tc>
+          <w:tcPr>
+            <w:tcW w:type="dxa" w:w="3321"/>
+          </w:tcPr>
+          <w:p>
+            <w:r>
+              <w:t>Option B carries higher competitive uncertainty, with differentiation requirements increasing during early positioning stages.</w:t>
+            </w:r>
+          </w:p>
+        </w:tc>
+      </w:tr>
+      <w:tr>
+        <w:tc>
+          <w:tcPr>
+            <w:tcW w:type="dxa" w:w="3321"/>
+          </w:tcPr>
+          <w:p>
+            <w:r>
+              <w:t>Economic Pressure</w:t>
+            </w:r>
+          </w:p>
+        </w:tc>
+        <w:tc>
+          <w:tcPr>
+            <w:tcW w:type="dxa" w:w="3321"/>
+          </w:tcPr>
+          <w:p>
+            <w:r>
+              <w:t>Option A preserves stronger continuity under tighter downside constraints, with lower near-term economic disruption risk.</w:t>
+            </w:r>
+          </w:p>
+        </w:tc>
+        <w:tc>
+          <w:tcPr>
+            <w:tcW w:type="dxa" w:w="3321"/>
+          </w:tcPr>
+          <w:p>
+            <w:r>
+              <w:t>Option B carries greater repositioning potential with higher structural friction and less near-term continuity.</w:t>
+            </w:r>
+          </w:p>
+        </w:tc>
+      </w:tr>
+      <w:tr>
+        <w:tc>
+          <w:tcPr>
+            <w:tcW w:type="dxa" w:w="3321"/>
+          </w:tcPr>
+          <w:p>
+            <w:r>
+              <w:t>Transition Friction</w:t>
+            </w:r>
+          </w:p>
+        </w:tc>
+        <w:tc>
+          <w:tcPr>
+            <w:tcW w:type="dxa" w:w="3321"/>
+          </w:tcPr>
+          <w:p>
+            <w:r>
+              <w:t>Option A maintains lower transition friction, supported by higher reversibility and reduced mobility burden.</w:t>
+            </w:r>
+          </w:p>
+        </w:tc>
+        <w:tc>
+          <w:tcPr>
+            <w:tcW w:type="dxa" w:w="3321"/>
+          </w:tcPr>
+          <w:p>
+            <w:r>
+              <w:t>Option B carries higher structural friction, with mobility and path-commit constraints increasing execution drag.</w:t>
+            </w:r>
+          </w:p>
+        </w:tc>
+      </w:tr>
+    </w:tbl>
+    <w:p>
+      <w:r>
+        <w:t>Comparative Reading</w:t>
+      </w:r>
+    </w:p>
+    <w:p>
+      <w:r>
+        <w:t>The two options differ primarily in continuity, external pressure, and transition cost.</w:t>
+      </w:r>
+    </w:p>
+    <w:p>
+      <w:r>
+        <w:t>Comparative Implication</w:t>
+      </w:r>
+    </w:p>
+    <w:p>
+      <w:r>
+        <w:t>The core trade-off lies between preserved continuity and greater long-horizon repositioning.</w:t>
       </w:r>
     </w:p>
     <w:p>

</xml_diff>

<commit_message>
Add normalized status comparison for external comparative snapshot
</commit_message>
<xml_diff>
--- a/output/AMC_Report_Latest_v3_3.docx
+++ b/output/AMC_Report_Latest_v3_3.docx
@@ -420,7 +420,7 @@
           </w:tcPr>
           <w:p>
             <w:r>
-              <w:t>Option A aligns with known market conditions, preserving directional visibility through lower external variance.</w:t>
+              <w:t>◆ Mixed</w:t>
             </w:r>
           </w:p>
         </w:tc>
@@ -430,7 +430,7 @@
           </w:tcPr>
           <w:p>
             <w:r>
-              <w:t>Option B offers broader repositioning exposure, though directional visibility remains more sensitive to cycle and policy variance.</w:t>
+              <w:t>◆ Mixed</w:t>
             </w:r>
           </w:p>
         </w:tc>
@@ -452,7 +452,7 @@
           </w:tcPr>
           <w:p>
             <w:r>
-              <w:t>Option A carries moderate competition pressure with transferable positioning from the current path architecture.</w:t>
+              <w:t>◐ Moderate</w:t>
             </w:r>
           </w:p>
         </w:tc>
@@ -462,7 +462,7 @@
           </w:tcPr>
           <w:p>
             <w:r>
-              <w:t>Option B carries higher competitive uncertainty, with differentiation requirements increasing during early positioning stages.</w:t>
+              <w:t>● Elevated</w:t>
             </w:r>
           </w:p>
         </w:tc>
@@ -484,7 +484,7 @@
           </w:tcPr>
           <w:p>
             <w:r>
-              <w:t>Option A preserves stronger continuity under tighter downside constraints, with lower near-term economic disruption risk.</w:t>
+              <w:t>○ Contained</w:t>
             </w:r>
           </w:p>
         </w:tc>
@@ -494,7 +494,7 @@
           </w:tcPr>
           <w:p>
             <w:r>
-              <w:t>Option B carries greater repositioning potential with higher structural friction and less near-term continuity.</w:t>
+              <w:t>● Elevated</w:t>
             </w:r>
           </w:p>
         </w:tc>
@@ -516,7 +516,7 @@
           </w:tcPr>
           <w:p>
             <w:r>
-              <w:t>Option A maintains lower transition friction, supported by higher reversibility and reduced mobility burden.</w:t>
+              <w:t>● Elevated</w:t>
             </w:r>
           </w:p>
         </w:tc>
@@ -526,7 +526,7 @@
           </w:tcPr>
           <w:p>
             <w:r>
-              <w:t>Option B carries higher structural friction, with mobility and path-commit constraints increasing execution drag.</w:t>
+              <w:t>● Elevated</w:t>
             </w:r>
           </w:p>
         </w:tc>

</xml_diff>

<commit_message>
Add legend to comparative external snapshot table
</commit_message>
<xml_diff>
--- a/output/AMC_Report_Latest_v3_3.docx
+++ b/output/AMC_Report_Latest_v3_3.docx
@@ -294,14 +294,6 @@
         <w:rPr>
           <w:b w:val="0"/>
         </w:rPr>
-        <w:t>Market Direction</w:t>
-      </w:r>
-    </w:p>
-    <w:p>
-      <w:r>
-        <w:rPr>
-          <w:b w:val="0"/>
-        </w:rPr>
         <w:t>Market direction appears mixed, with directional visibility present but still moderated by external policy and cycle uncertainty.</w:t>
       </w:r>
     </w:p>
@@ -532,6 +524,53 @@
         </w:tc>
       </w:tr>
     </w:tbl>
+    <w:p>
+      <w:r>
+        <w:t>● Elevated = concentrated structural pressure</w:t>
+      </w:r>
+    </w:p>
+    <w:p>
+      <w:r>
+        <w:t>◐ Moderate = manageable but active pressure</w:t>
+      </w:r>
+    </w:p>
+    <w:p>
+      <w:r>
+        <w:t>○ Contained = lower structural pressure</w:t>
+      </w:r>
+    </w:p>
+    <w:p>
+      <w:r>
+        <w:rPr>
+          <w:b/>
+        </w:rPr>
+        <w:t>Pressure / Friction</w:t>
+      </w:r>
+    </w:p>
+    <w:p>
+      <w:pPr/>
+      <w:r>
+        <w:t>▼ Constrained = structurally limited direction</w:t>
+      </w:r>
+    </w:p>
+    <w:p>
+      <w:r>
+        <w:t>◆ Mixed = balanced but uneven direction</w:t>
+      </w:r>
+    </w:p>
+    <w:p>
+      <w:r>
+        <w:t>▲ Supportive = structurally favorable direction</w:t>
+      </w:r>
+    </w:p>
+    <w:p>
+      <w:r>
+        <w:rPr>
+          <w:b/>
+        </w:rPr>
+        <w:t>Market Direction</w:t>
+      </w:r>
+    </w:p>
     <w:p>
       <w:r>
         <w:t>Comparative Reading</w:t>

</xml_diff>